<commit_message>
docs: completar enlace al repositorio en el reporte tecnico
</commit_message>
<xml_diff>
--- a/Ae5_Reporte_Tecnico_Caicedo_Quintero.docx
+++ b/Ae5_Reporte_Tecnico_Caicedo_Quintero.docx
@@ -3050,11 +3050,15 @@
         <w:spacing w:after="140"/>
       </w:pPr>
       <w:r>
-        <w:rPr>
-          <w:i/>
-          <w:iCs/>
-        </w:rPr>
-        <w:t xml:space="preserve">[Completar antes de entregar: subir la carpeta reservas-refactor/ a un repositorio propio (GitHub/GitLab) con 'git remote add origin &lt;URL&gt;' y 'git push -u origin master', y pegar aquí el enlace resultante.]</w:t>
+        <w:t xml:space="preserve">Repositorio del proyecto: https://github.com/bexyiicaicedo/ae5-reservas-refactor</w:t>
+      </w:r>
+    </w:p>
+    <w:p>
+      <w:pPr>
+        <w:spacing w:after="140"/>
+      </w:pPr>
+      <w:r>
+        <w:t xml:space="preserve">El historial de commits es visible públicamente en la pestaña principal del repositorio, incluyendo los mensajes completos de cada refactorización descritos en las secciones 6, 7 y 8 de este reporte.</w:t>
       </w:r>
     </w:p>
     <w:p>

</xml_diff>

<commit_message>
docs: agregar anexo con capturas de pantalla al reporte tecnico
</commit_message>
<xml_diff>
--- a/Ae5_Reporte_Tecnico_Caicedo_Quintero.docx
+++ b/Ae5_Reporte_Tecnico_Caicedo_Quintero.docx
@@ -3185,6 +3185,709 @@
       </w:pPr>
       <w:r>
         <w:t xml:space="preserve">Declaración de uso de IA — sección 12 de este reporte.</w:t>
+      </w:r>
+    </w:p>
+    <w:p>
+      <w:r>
+        <w:br w:type="page"/>
+      </w:r>
+    </w:p>
+    <w:p>
+      <w:pPr>
+        <w:pStyle w:val="Heading1"/>
+        <w:spacing w:after="160" w:before="360"/>
+      </w:pPr>
+      <w:r>
+        <w:t xml:space="preserve">15. Anexo: Capturas de pantalla</w:t>
+      </w:r>
+    </w:p>
+    <w:p>
+      <w:pPr>
+        <w:spacing w:after="140"/>
+      </w:pPr>
+      <w:r>
+        <w:t xml:space="preserve">Evidencia visual de la ejecución real del proyecto en Visual Studio Code y GitHub, tomada directamente en el entorno de trabajo de la estudiante.</w:t>
+      </w:r>
+    </w:p>
+    <w:p>
+      <w:pPr>
+        <w:pStyle w:val="Heading2"/>
+        <w:spacing w:after="120" w:before="240"/>
+      </w:pPr>
+      <w:r>
+        <w:t xml:space="preserve">Captura 1 — mvn test ejecutado desde el panel de Maven (VS Code)</w:t>
+      </w:r>
+    </w:p>
+    <w:p>
+      <w:pPr>
+        <w:spacing w:after="80"/>
+      </w:pPr>
+      <w:r>
+        <w:drawing>
+          <wp:inline distT="0" distB="0" distL="0" distR="0">
+            <wp:extent cx="5524500" cy="4543425"/>
+            <wp:effectExtent t="0" r="0" b="0" l="0"/>
+            <wp:docPr id="1" name="" descr="" title=""/>
+            <wp:cNvGraphicFramePr>
+              <a:graphicFrameLocks xmlns:a="http://schemas.openxmlformats.org/drawingml/2006/main" noChangeAspect="1"/>
+            </wp:cNvGraphicFramePr>
+            <a:graphic xmlns:a="http://schemas.openxmlformats.org/drawingml/2006/main">
+              <a:graphicData uri="http://schemas.openxmlformats.org/drawingml/2006/picture">
+                <pic:pic xmlns:pic="http://schemas.openxmlformats.org/drawingml/2006/picture">
+                  <pic:nvPicPr>
+                    <pic:cNvPr id="0" name="" descr=""/>
+                    <pic:cNvPicPr>
+                      <a:picLocks noChangeAspect="1" noChangeArrowheads="1"/>
+                    </pic:cNvPicPr>
+                  </pic:nvPicPr>
+                  <pic:blipFill>
+                    <a:blip r:embed="rId7" cstate="none"/>
+                    <a:srcRect/>
+                    <a:stretch>
+                      <a:fillRect/>
+                    </a:stretch>
+                  </pic:blipFill>
+                  <pic:spPr bwMode="auto">
+                    <a:xfrm>
+                      <a:off x="0" y="0"/>
+                      <a:ext cx="5524500" cy="4543425"/>
+                    </a:xfrm>
+                    <a:prstGeom prst="rect">
+                      <a:avLst/>
+                    </a:prstGeom>
+                  </pic:spPr>
+                </pic:pic>
+              </a:graphicData>
+            </a:graphic>
+          </wp:inline>
+        </w:drawing>
+      </w:r>
+    </w:p>
+    <w:p>
+      <w:pPr>
+        <w:spacing w:after="240"/>
+      </w:pPr>
+      <w:r>
+        <w:rPr>
+          <w:i/>
+          <w:iCs/>
+          <w:color w:val="555555"/>
+          <w:sz w:val="18"/>
+          <w:szCs w:val="18"/>
+        </w:rPr>
+        <w:t xml:space="preserve">Inicio del log: compilación de 6 clases de producción y 2 de prueba (javac --release 17).</w:t>
+      </w:r>
+    </w:p>
+    <w:p>
+      <w:pPr>
+        <w:spacing w:after="80"/>
+      </w:pPr>
+      <w:r>
+        <w:drawing>
+          <wp:inline distT="0" distB="0" distL="0" distR="0">
+            <wp:extent cx="5524500" cy="4419600"/>
+            <wp:effectExtent t="0" r="0" b="0" l="0"/>
+            <wp:docPr id="1" name="" descr="" title=""/>
+            <wp:cNvGraphicFramePr>
+              <a:graphicFrameLocks xmlns:a="http://schemas.openxmlformats.org/drawingml/2006/main" noChangeAspect="1"/>
+            </wp:cNvGraphicFramePr>
+            <a:graphic xmlns:a="http://schemas.openxmlformats.org/drawingml/2006/main">
+              <a:graphicData uri="http://schemas.openxmlformats.org/drawingml/2006/picture">
+                <pic:pic xmlns:pic="http://schemas.openxmlformats.org/drawingml/2006/picture">
+                  <pic:nvPicPr>
+                    <pic:cNvPr id="0" name="" descr=""/>
+                    <pic:cNvPicPr>
+                      <a:picLocks noChangeAspect="1" noChangeArrowheads="1"/>
+                    </pic:cNvPicPr>
+                  </pic:nvPicPr>
+                  <pic:blipFill>
+                    <a:blip r:embed="rId8" cstate="none"/>
+                    <a:srcRect/>
+                    <a:stretch>
+                      <a:fillRect/>
+                    </a:stretch>
+                  </pic:blipFill>
+                  <pic:spPr bwMode="auto">
+                    <a:xfrm>
+                      <a:off x="0" y="0"/>
+                      <a:ext cx="5524500" cy="4419600"/>
+                    </a:xfrm>
+                    <a:prstGeom prst="rect">
+                      <a:avLst/>
+                    </a:prstGeom>
+                  </pic:spPr>
+                </pic:pic>
+              </a:graphicData>
+            </a:graphic>
+          </wp:inline>
+        </w:drawing>
+      </w:r>
+    </w:p>
+    <w:p>
+      <w:pPr>
+        <w:spacing w:after="240"/>
+      </w:pPr>
+      <w:r>
+        <w:rPr>
+          <w:i/>
+          <w:iCs/>
+          <w:color w:val="555555"/>
+          <w:sz w:val="18"/>
+          <w:szCs w:val="18"/>
+        </w:rPr>
+        <w:t xml:space="preserve">Cierre del log: Tests run: 19, Failures: 0, Errors: 0, Skipped: 0 — BUILD SUCCESS.</w:t>
+      </w:r>
+    </w:p>
+    <w:p>
+      <w:pPr>
+        <w:pStyle w:val="Heading2"/>
+        <w:spacing w:after="120" w:before="240"/>
+      </w:pPr>
+      <w:r>
+        <w:t xml:space="preserve">Captura 2 — Panel de Testing de VS Code (Test Runner for Java)</w:t>
+      </w:r>
+    </w:p>
+    <w:p>
+      <w:pPr>
+        <w:spacing w:after="80"/>
+      </w:pPr>
+      <w:r>
+        <w:drawing>
+          <wp:inline distT="0" distB="0" distL="0" distR="0">
+            <wp:extent cx="5524500" cy="3448050"/>
+            <wp:effectExtent t="0" r="0" b="0" l="0"/>
+            <wp:docPr id="1" name="" descr="" title=""/>
+            <wp:cNvGraphicFramePr>
+              <a:graphicFrameLocks xmlns:a="http://schemas.openxmlformats.org/drawingml/2006/main" noChangeAspect="1"/>
+            </wp:cNvGraphicFramePr>
+            <a:graphic xmlns:a="http://schemas.openxmlformats.org/drawingml/2006/main">
+              <a:graphicData uri="http://schemas.openxmlformats.org/drawingml/2006/picture">
+                <pic:pic xmlns:pic="http://schemas.openxmlformats.org/drawingml/2006/picture">
+                  <pic:nvPicPr>
+                    <pic:cNvPr id="0" name="" descr=""/>
+                    <pic:cNvPicPr>
+                      <a:picLocks noChangeAspect="1" noChangeArrowheads="1"/>
+                    </pic:cNvPicPr>
+                  </pic:nvPicPr>
+                  <pic:blipFill>
+                    <a:blip r:embed="rId9" cstate="none"/>
+                    <a:srcRect/>
+                    <a:stretch>
+                      <a:fillRect/>
+                    </a:stretch>
+                  </pic:blipFill>
+                  <pic:spPr bwMode="auto">
+                    <a:xfrm>
+                      <a:off x="0" y="0"/>
+                      <a:ext cx="5524500" cy="3448050"/>
+                    </a:xfrm>
+                    <a:prstGeom prst="rect">
+                      <a:avLst/>
+                    </a:prstGeom>
+                  </pic:spPr>
+                </pic:pic>
+              </a:graphicData>
+            </a:graphic>
+          </wp:inline>
+        </w:drawing>
+      </w:r>
+    </w:p>
+    <w:p>
+      <w:pPr>
+        <w:spacing w:after="240"/>
+      </w:pPr>
+      <w:r>
+        <w:rPr>
+          <w:i/>
+          <w:iCs/>
+          <w:color w:val="555555"/>
+          <w:sz w:val="18"/>
+          <w:szCs w:val="18"/>
+        </w:rPr>
+        <w:t xml:space="preserve">23/23 en verde: 19 métodos de prueba reales agrupados en clases y @Nested (CorreoTest + ReservaServiceTest).</w:t>
+      </w:r>
+    </w:p>
+    <w:p>
+      <w:pPr>
+        <w:pStyle w:val="Heading2"/>
+        <w:spacing w:after="120" w:before="240"/>
+      </w:pPr>
+      <w:r>
+        <w:t xml:space="preserve">Captura 3 — Refactorización 3 (Guard Clauses) en ReservaService.java</w:t>
+      </w:r>
+    </w:p>
+    <w:p>
+      <w:pPr>
+        <w:spacing w:after="80"/>
+      </w:pPr>
+      <w:r>
+        <w:drawing>
+          <wp:inline distT="0" distB="0" distL="0" distR="0">
+            <wp:extent cx="5524500" cy="2219325"/>
+            <wp:effectExtent t="0" r="0" b="0" l="0"/>
+            <wp:docPr id="1" name="" descr="" title=""/>
+            <wp:cNvGraphicFramePr>
+              <a:graphicFrameLocks xmlns:a="http://schemas.openxmlformats.org/drawingml/2006/main" noChangeAspect="1"/>
+            </wp:cNvGraphicFramePr>
+            <a:graphic xmlns:a="http://schemas.openxmlformats.org/drawingml/2006/main">
+              <a:graphicData uri="http://schemas.openxmlformats.org/drawingml/2006/picture">
+                <pic:pic xmlns:pic="http://schemas.openxmlformats.org/drawingml/2006/picture">
+                  <pic:nvPicPr>
+                    <pic:cNvPr id="0" name="" descr=""/>
+                    <pic:cNvPicPr>
+                      <a:picLocks noChangeAspect="1" noChangeArrowheads="1"/>
+                    </pic:cNvPicPr>
+                  </pic:nvPicPr>
+                  <pic:blipFill>
+                    <a:blip r:embed="rId10" cstate="none"/>
+                    <a:srcRect/>
+                    <a:stretch>
+                      <a:fillRect/>
+                    </a:stretch>
+                  </pic:blipFill>
+                  <pic:spPr bwMode="auto">
+                    <a:xfrm>
+                      <a:off x="0" y="0"/>
+                      <a:ext cx="5524500" cy="2219325"/>
+                    </a:xfrm>
+                    <a:prstGeom prst="rect">
+                      <a:avLst/>
+                    </a:prstGeom>
+                  </pic:spPr>
+                </pic:pic>
+              </a:graphicData>
+            </a:graphic>
+          </wp:inline>
+        </w:drawing>
+      </w:r>
+    </w:p>
+    <w:p>
+      <w:pPr>
+        <w:spacing w:after="240"/>
+      </w:pPr>
+      <w:r>
+        <w:rPr>
+          <w:i/>
+          <w:iCs/>
+          <w:color w:val="555555"/>
+          <w:sz w:val="18"/>
+          <w:szCs w:val="18"/>
+        </w:rPr>
+        <w:t xml:space="preserve">Método confirmar() con las 4 guard clauses y el camino feliz al final, sin anidamiento.</w:t>
+      </w:r>
+    </w:p>
+    <w:p>
+      <w:pPr>
+        <w:pStyle w:val="Heading2"/>
+        <w:spacing w:after="120" w:before="240"/>
+      </w:pPr>
+      <w:r>
+        <w:t xml:space="preserve">Captura 4 — Refactorización 2 (Value Object) en Correo.java</w:t>
+      </w:r>
+    </w:p>
+    <w:p>
+      <w:pPr>
+        <w:spacing w:after="80"/>
+      </w:pPr>
+      <w:r>
+        <w:drawing>
+          <wp:inline distT="0" distB="0" distL="0" distR="0">
+            <wp:extent cx="5524500" cy="2486025"/>
+            <wp:effectExtent t="0" r="0" b="0" l="0"/>
+            <wp:docPr id="1" name="" descr="" title=""/>
+            <wp:cNvGraphicFramePr>
+              <a:graphicFrameLocks xmlns:a="http://schemas.openxmlformats.org/drawingml/2006/main" noChangeAspect="1"/>
+            </wp:cNvGraphicFramePr>
+            <a:graphic xmlns:a="http://schemas.openxmlformats.org/drawingml/2006/main">
+              <a:graphicData uri="http://schemas.openxmlformats.org/drawingml/2006/picture">
+                <pic:pic xmlns:pic="http://schemas.openxmlformats.org/drawingml/2006/picture">
+                  <pic:nvPicPr>
+                    <pic:cNvPr id="0" name="" descr=""/>
+                    <pic:cNvPicPr>
+                      <a:picLocks noChangeAspect="1" noChangeArrowheads="1"/>
+                    </pic:cNvPicPr>
+                  </pic:nvPicPr>
+                  <pic:blipFill>
+                    <a:blip r:embed="rId11" cstate="none"/>
+                    <a:srcRect/>
+                    <a:stretch>
+                      <a:fillRect/>
+                    </a:stretch>
+                  </pic:blipFill>
+                  <pic:spPr bwMode="auto">
+                    <a:xfrm>
+                      <a:off x="0" y="0"/>
+                      <a:ext cx="5524500" cy="2486025"/>
+                    </a:xfrm>
+                    <a:prstGeom prst="rect">
+                      <a:avLst/>
+                    </a:prstGeom>
+                  </pic:spPr>
+                </pic:pic>
+              </a:graphicData>
+            </a:graphic>
+          </wp:inline>
+        </w:drawing>
+      </w:r>
+    </w:p>
+    <w:p>
+      <w:pPr>
+        <w:spacing w:after="240"/>
+      </w:pPr>
+      <w:r>
+        <w:rPr>
+          <w:i/>
+          <w:iCs/>
+          <w:color w:val="555555"/>
+          <w:sz w:val="18"/>
+          <w:szCs w:val="18"/>
+        </w:rPr>
+        <w:t xml:space="preserve">record Correo con el invariante verificado en el constructor compacto y esValido() como única fuente de verdad.</w:t>
+      </w:r>
+    </w:p>
+    <w:p>
+      <w:pPr>
+        <w:pStyle w:val="Heading2"/>
+        <w:spacing w:after="120" w:before="240"/>
+      </w:pPr>
+      <w:r>
+        <w:t xml:space="preserve">Captura 5 — Historial de commits (git log --oneline)</w:t>
+      </w:r>
+    </w:p>
+    <w:p>
+      <w:pPr>
+        <w:spacing w:after="80"/>
+      </w:pPr>
+      <w:r>
+        <w:drawing>
+          <wp:inline distT="0" distB="0" distL="0" distR="0">
+            <wp:extent cx="5524500" cy="3505200"/>
+            <wp:effectExtent t="0" r="0" b="0" l="0"/>
+            <wp:docPr id="1" name="" descr="" title=""/>
+            <wp:cNvGraphicFramePr>
+              <a:graphicFrameLocks xmlns:a="http://schemas.openxmlformats.org/drawingml/2006/main" noChangeAspect="1"/>
+            </wp:cNvGraphicFramePr>
+            <a:graphic xmlns:a="http://schemas.openxmlformats.org/drawingml/2006/main">
+              <a:graphicData uri="http://schemas.openxmlformats.org/drawingml/2006/picture">
+                <pic:pic xmlns:pic="http://schemas.openxmlformats.org/drawingml/2006/picture">
+                  <pic:nvPicPr>
+                    <pic:cNvPr id="0" name="" descr=""/>
+                    <pic:cNvPicPr>
+                      <a:picLocks noChangeAspect="1" noChangeArrowheads="1"/>
+                    </pic:cNvPicPr>
+                  </pic:nvPicPr>
+                  <pic:blipFill>
+                    <a:blip r:embed="rId12" cstate="none"/>
+                    <a:srcRect/>
+                    <a:stretch>
+                      <a:fillRect/>
+                    </a:stretch>
+                  </pic:blipFill>
+                  <pic:spPr bwMode="auto">
+                    <a:xfrm>
+                      <a:off x="0" y="0"/>
+                      <a:ext cx="5524500" cy="3505200"/>
+                    </a:xfrm>
+                    <a:prstGeom prst="rect">
+                      <a:avLst/>
+                    </a:prstGeom>
+                  </pic:spPr>
+                </pic:pic>
+              </a:graphicData>
+            </a:graphic>
+          </wp:inline>
+        </w:drawing>
+      </w:r>
+    </w:p>
+    <w:p>
+      <w:pPr>
+        <w:spacing w:after="240"/>
+      </w:pPr>
+      <w:r>
+        <w:rPr>
+          <w:i/>
+          <w:iCs/>
+          <w:color w:val="555555"/>
+          <w:sz w:val="18"/>
+          <w:szCs w:val="18"/>
+        </w:rPr>
+        <w:t xml:space="preserve">7 commits visibles en orden: base heredada, las 3 refactorizaciones y los commits de documentación.</w:t>
+      </w:r>
+    </w:p>
+    <w:p>
+      <w:pPr>
+        <w:pStyle w:val="Heading2"/>
+        <w:spacing w:after="120" w:before="240"/>
+      </w:pPr>
+      <w:r>
+        <w:t xml:space="preserve">Captura 6 — Detalle del commit del Value Object (git show 51f66d6 --no-patch)</w:t>
+      </w:r>
+    </w:p>
+    <w:p>
+      <w:pPr>
+        <w:spacing w:after="80"/>
+      </w:pPr>
+      <w:r>
+        <w:drawing>
+          <wp:inline distT="0" distB="0" distL="0" distR="0">
+            <wp:extent cx="5524500" cy="4276725"/>
+            <wp:effectExtent t="0" r="0" b="0" l="0"/>
+            <wp:docPr id="1" name="" descr="" title=""/>
+            <wp:cNvGraphicFramePr>
+              <a:graphicFrameLocks xmlns:a="http://schemas.openxmlformats.org/drawingml/2006/main" noChangeAspect="1"/>
+            </wp:cNvGraphicFramePr>
+            <a:graphic xmlns:a="http://schemas.openxmlformats.org/drawingml/2006/main">
+              <a:graphicData uri="http://schemas.openxmlformats.org/drawingml/2006/picture">
+                <pic:pic xmlns:pic="http://schemas.openxmlformats.org/drawingml/2006/picture">
+                  <pic:nvPicPr>
+                    <pic:cNvPr id="0" name="" descr=""/>
+                    <pic:cNvPicPr>
+                      <a:picLocks noChangeAspect="1" noChangeArrowheads="1"/>
+                    </pic:cNvPicPr>
+                  </pic:nvPicPr>
+                  <pic:blipFill>
+                    <a:blip r:embed="rId13" cstate="none"/>
+                    <a:srcRect/>
+                    <a:stretch>
+                      <a:fillRect/>
+                    </a:stretch>
+                  </pic:blipFill>
+                  <pic:spPr bwMode="auto">
+                    <a:xfrm>
+                      <a:off x="0" y="0"/>
+                      <a:ext cx="5524500" cy="4276725"/>
+                    </a:xfrm>
+                    <a:prstGeom prst="rect">
+                      <a:avLst/>
+                    </a:prstGeom>
+                  </pic:spPr>
+                </pic:pic>
+              </a:graphicData>
+            </a:graphic>
+          </wp:inline>
+        </w:drawing>
+      </w:r>
+    </w:p>
+    <w:p>
+      <w:pPr>
+        <w:spacing w:after="240"/>
+      </w:pPr>
+      <w:r>
+        <w:rPr>
+          <w:i/>
+          <w:iCs/>
+          <w:color w:val="555555"/>
+          <w:sz w:val="18"/>
+          <w:szCs w:val="18"/>
+        </w:rPr>
+        <w:t xml:space="preserve">Mensaje completo del commit 51f66d6, incluyendo el riesgo detectado por la red de pruebas (sección 7.3 de este reporte).</w:t>
+      </w:r>
+    </w:p>
+    <w:p>
+      <w:pPr>
+        <w:pStyle w:val="Heading2"/>
+        <w:spacing w:after="120" w:before="240"/>
+      </w:pPr>
+      <w:r>
+        <w:t xml:space="preserve">Captura 7 — Página principal del repositorio en GitHub</w:t>
+      </w:r>
+    </w:p>
+    <w:p>
+      <w:pPr>
+        <w:spacing w:after="80"/>
+      </w:pPr>
+      <w:r>
+        <w:drawing>
+          <wp:inline distT="0" distB="0" distL="0" distR="0">
+            <wp:extent cx="5524500" cy="3190875"/>
+            <wp:effectExtent t="0" r="0" b="0" l="0"/>
+            <wp:docPr id="1" name="" descr="" title=""/>
+            <wp:cNvGraphicFramePr>
+              <a:graphicFrameLocks xmlns:a="http://schemas.openxmlformats.org/drawingml/2006/main" noChangeAspect="1"/>
+            </wp:cNvGraphicFramePr>
+            <a:graphic xmlns:a="http://schemas.openxmlformats.org/drawingml/2006/main">
+              <a:graphicData uri="http://schemas.openxmlformats.org/drawingml/2006/picture">
+                <pic:pic xmlns:pic="http://schemas.openxmlformats.org/drawingml/2006/picture">
+                  <pic:nvPicPr>
+                    <pic:cNvPr id="0" name="" descr=""/>
+                    <pic:cNvPicPr>
+                      <a:picLocks noChangeAspect="1" noChangeArrowheads="1"/>
+                    </pic:cNvPicPr>
+                  </pic:nvPicPr>
+                  <pic:blipFill>
+                    <a:blip r:embed="rId14" cstate="none"/>
+                    <a:srcRect/>
+                    <a:stretch>
+                      <a:fillRect/>
+                    </a:stretch>
+                  </pic:blipFill>
+                  <pic:spPr bwMode="auto">
+                    <a:xfrm>
+                      <a:off x="0" y="0"/>
+                      <a:ext cx="5524500" cy="3190875"/>
+                    </a:xfrm>
+                    <a:prstGeom prst="rect">
+                      <a:avLst/>
+                    </a:prstGeom>
+                  </pic:spPr>
+                </pic:pic>
+              </a:graphicData>
+            </a:graphic>
+          </wp:inline>
+        </w:drawing>
+      </w:r>
+    </w:p>
+    <w:p>
+      <w:pPr>
+        <w:spacing w:after="240"/>
+      </w:pPr>
+      <w:r>
+        <w:rPr>
+          <w:i/>
+          <w:iCs/>
+          <w:color w:val="555555"/>
+          <w:sz w:val="18"/>
+          <w:szCs w:val="18"/>
+        </w:rPr>
+        <w:t xml:space="preserve">github.com/bexyiicaicedo/ae5-reservas-refactor — estructura de carpetas y README renderizado.</w:t>
+      </w:r>
+    </w:p>
+    <w:p>
+      <w:pPr>
+        <w:pStyle w:val="Heading2"/>
+        <w:spacing w:after="120" w:before="240"/>
+      </w:pPr>
+      <w:r>
+        <w:t xml:space="preserve">Captura 8 — Lista de commits en GitHub</w:t>
+      </w:r>
+    </w:p>
+    <w:p>
+      <w:pPr>
+        <w:spacing w:after="80"/>
+      </w:pPr>
+      <w:r>
+        <w:drawing>
+          <wp:inline distT="0" distB="0" distL="0" distR="0">
+            <wp:extent cx="5524500" cy="3038475"/>
+            <wp:effectExtent t="0" r="0" b="0" l="0"/>
+            <wp:docPr id="1" name="" descr="" title=""/>
+            <wp:cNvGraphicFramePr>
+              <a:graphicFrameLocks xmlns:a="http://schemas.openxmlformats.org/drawingml/2006/main" noChangeAspect="1"/>
+            </wp:cNvGraphicFramePr>
+            <a:graphic xmlns:a="http://schemas.openxmlformats.org/drawingml/2006/main">
+              <a:graphicData uri="http://schemas.openxmlformats.org/drawingml/2006/picture">
+                <pic:pic xmlns:pic="http://schemas.openxmlformats.org/drawingml/2006/picture">
+                  <pic:nvPicPr>
+                    <pic:cNvPr id="0" name="" descr=""/>
+                    <pic:cNvPicPr>
+                      <a:picLocks noChangeAspect="1" noChangeArrowheads="1"/>
+                    </pic:cNvPicPr>
+                  </pic:nvPicPr>
+                  <pic:blipFill>
+                    <a:blip r:embed="rId15" cstate="none"/>
+                    <a:srcRect/>
+                    <a:stretch>
+                      <a:fillRect/>
+                    </a:stretch>
+                  </pic:blipFill>
+                  <pic:spPr bwMode="auto">
+                    <a:xfrm>
+                      <a:off x="0" y="0"/>
+                      <a:ext cx="5524500" cy="3038475"/>
+                    </a:xfrm>
+                    <a:prstGeom prst="rect">
+                      <a:avLst/>
+                    </a:prstGeom>
+                  </pic:spPr>
+                </pic:pic>
+              </a:graphicData>
+            </a:graphic>
+          </wp:inline>
+        </w:drawing>
+      </w:r>
+    </w:p>
+    <w:p>
+      <w:pPr>
+        <w:spacing w:after="240"/>
+      </w:pPr>
+      <w:r>
+        <w:rPr>
+          <w:i/>
+          <w:iCs/>
+          <w:color w:val="555555"/>
+          <w:sz w:val="18"/>
+          <w:szCs w:val="18"/>
+        </w:rPr>
+        <w:t xml:space="preserve">Los 7 commits con autor (Ruth Betsabe Caicedo Quintero) y hash abreviado, visibles públicamente.</w:t>
+      </w:r>
+    </w:p>
+    <w:p>
+      <w:pPr>
+        <w:pStyle w:val="Heading2"/>
+        <w:spacing w:after="120" w:before="240"/>
+      </w:pPr>
+      <w:r>
+        <w:t xml:space="preserve">Captura 9 — Diff del commit del Value Object en GitHub</w:t>
+      </w:r>
+    </w:p>
+    <w:p>
+      <w:pPr>
+        <w:spacing w:after="80"/>
+      </w:pPr>
+      <w:r>
+        <w:drawing>
+          <wp:inline distT="0" distB="0" distL="0" distR="0">
+            <wp:extent cx="5524500" cy="2838450"/>
+            <wp:effectExtent t="0" r="0" b="0" l="0"/>
+            <wp:docPr id="1" name="" descr="" title=""/>
+            <wp:cNvGraphicFramePr>
+              <a:graphicFrameLocks xmlns:a="http://schemas.openxmlformats.org/drawingml/2006/main" noChangeAspect="1"/>
+            </wp:cNvGraphicFramePr>
+            <a:graphic xmlns:a="http://schemas.openxmlformats.org/drawingml/2006/main">
+              <a:graphicData uri="http://schemas.openxmlformats.org/drawingml/2006/picture">
+                <pic:pic xmlns:pic="http://schemas.openxmlformats.org/drawingml/2006/picture">
+                  <pic:nvPicPr>
+                    <pic:cNvPr id="0" name="" descr=""/>
+                    <pic:cNvPicPr>
+                      <a:picLocks noChangeAspect="1" noChangeArrowheads="1"/>
+                    </pic:cNvPicPr>
+                  </pic:nvPicPr>
+                  <pic:blipFill>
+                    <a:blip r:embed="rId16" cstate="none"/>
+                    <a:srcRect/>
+                    <a:stretch>
+                      <a:fillRect/>
+                    </a:stretch>
+                  </pic:blipFill>
+                  <pic:spPr bwMode="auto">
+                    <a:xfrm>
+                      <a:off x="0" y="0"/>
+                      <a:ext cx="5524500" cy="2838450"/>
+                    </a:xfrm>
+                    <a:prstGeom prst="rect">
+                      <a:avLst/>
+                    </a:prstGeom>
+                  </pic:spPr>
+                </pic:pic>
+              </a:graphicData>
+            </a:graphic>
+          </wp:inline>
+        </w:drawing>
+      </w:r>
+    </w:p>
+    <w:p>
+      <w:pPr>
+        <w:spacing w:after="240"/>
+      </w:pPr>
+      <w:r>
+        <w:rPr>
+          <w:i/>
+          <w:iCs/>
+          <w:color w:val="555555"/>
+          <w:sz w:val="18"/>
+          <w:szCs w:val="18"/>
+        </w:rPr>
+        <w:t xml:space="preserve">Cambio real en NotificadorReserva.java: se elimina el Predicate&lt;String&gt; inyectado y se reemplaza por la construcción directa de Correo.</w:t>
       </w:r>
     </w:p>
     <w:sectPr>

</xml_diff>